<commit_message>
machine-redaction: mission_summary variable (fin du ERP en dur), toilettage typographique des 8 sources
</commit_message>
<xml_diff>
--- a/machines/Modèles de docx/Approche de gestion.docx
+++ b/machines/Modèles de docx/Approche de gestion.docx
@@ -74,7 +74,7 @@
         <w:t>Projet</w:t>
       </w:r>
       <w:r>
-        <w:t xml:space="preserve">  {project_name}</w:t>
+        <w:t xml:space="preserve"> {project_name}</w:t>
       </w:r>
     </w:p>
     <w:p>
@@ -91,7 +91,7 @@
         <w:t>Client</w:t>
       </w:r>
       <w:r>
-        <w:t xml:space="preserve">  {client_name}</w:t>
+        <w:t xml:space="preserve"> {client_name}</w:t>
       </w:r>
     </w:p>
     <w:tbl>
@@ -1141,7 +1141,7 @@
         <w:ind w:left="140" w:right="333"/>
       </w:pPr>
       <w:r>
-        <w:t>L’actuel document présente l’approche de gestion du projet, en précisant concrètement les éléments suivants :</w:t>
+        <w:t>L’actuel document présente l’approche de gestion du projet, en précisant concrètement les éléments suivants :</w:t>
       </w:r>
     </w:p>
     <w:p>
@@ -5645,7 +5645,7 @@
         <w:t xml:space="preserve"> </w:t>
       </w:r>
       <w:r>
-        <w:t>présentation), via les canaux suivants :</w:t>
+        <w:t>présentation), via les canaux suivants :</w:t>
       </w:r>
     </w:p>
     <w:p>
@@ -5669,7 +5669,7 @@
         <w:rPr>
           <w:sz w:val="23"/>
         </w:rPr>
-        <w:t>Groupe WhatsApp pour des échanges fluides et pour favoriser des retours instantanés ;</w:t>
+        <w:t>Groupe WhatsApp pour des échanges fluides et pour favoriser des retours instantanés ;</w:t>
       </w:r>
     </w:p>
     <w:p>
@@ -5952,7 +5952,7 @@
         <w:rPr>
           <w:sz w:val="23"/>
         </w:rPr>
-        <w:t>ou de groupe. Cela pour garder toutes les parties prenantes concernées au même niveau d’information) ;</w:t>
+        <w:t>ou de groupe. Cela pour garder toutes les parties prenantes concernées au même niveau d’information) ;</w:t>
       </w:r>
     </w:p>
     <w:p>
@@ -6166,7 +6166,7 @@
         <w:t xml:space="preserve"> </w:t>
       </w:r>
       <w:r>
-        <w:t>Ce dernier déterminera :</w:t>
+        <w:t>Ce dernier déterminera :</w:t>
       </w:r>
     </w:p>
     <w:p>

</xml_diff>

<commit_message>
machine-redaction: contrat de forme applique aux 8 documents (polices explicites, puces litterales), livrables du jour
</commit_message>
<xml_diff>
--- a/machines/Modèles de docx/Approche de gestion.docx
+++ b/machines/Modèles de docx/Approche de gestion.docx
@@ -26,8 +26,8 @@
       <w:r>
         <w:rPr>
           <w:color w:val="1F5FAF"/>
-          <w:sz w:val="34"/>
-          <w:szCs w:val="34"/>
+          <w:sz w:val="36"/>
+          <w:szCs w:val="36"/>
         </w:rPr>
         <w:t>GINUTECH</w:t>
       </w:r>
@@ -1139,6 +1139,7 @@
         <w:pStyle w:val="BodyText"/>
         <w:spacing w:before="122" w:line="360" w:lineRule="auto"/>
         <w:ind w:left="140" w:right="333"/>
+        <w:jc w:val="both"/>
       </w:pPr>
       <w:r>
         <w:t>L’actuel document présente l’approche de gestion du projet, en précisant concrètement les éléments suivants :</w:t>
@@ -2327,6 +2328,7 @@
         <w:pStyle w:val="BodyText"/>
         <w:spacing w:before="289" w:line="360" w:lineRule="auto"/>
         <w:ind w:left="140"/>
+        <w:jc w:val="both"/>
         <w:rPr>
           <w:b/>
           <w:i/>
@@ -2785,6 +2787,7 @@
       <w:pPr>
         <w:spacing w:line="360" w:lineRule="auto"/>
         <w:ind w:left="140"/>
+        <w:jc w:val="both"/>
         <w:rPr>
           <w:b/>
           <w:i/>
@@ -4590,6 +4593,7 @@
         <w:pStyle w:val="BodyText"/>
         <w:spacing w:before="35"/>
         <w:ind w:left="140"/>
+        <w:jc w:val="both"/>
       </w:pPr>
       <w:r>
         <w:lastRenderedPageBreak/>
@@ -4769,6 +4773,7 @@
           <w:tab w:val="left" w:pos="860"/>
         </w:tabs>
         <w:ind w:left="860"/>
+        <w:jc w:val="both"/>
         <w:rPr>
           <w:sz w:val="23"/>
         </w:rPr>
@@ -5309,6 +5314,7 @@
         <w:pStyle w:val="BodyText"/>
         <w:spacing w:line="360" w:lineRule="auto"/>
         <w:ind w:left="140"/>
+        <w:jc w:val="both"/>
       </w:pPr>
       <w:r>
         <w:rPr>
@@ -8600,6 +8606,7 @@
         </w:tabs>
         <w:spacing w:line="360" w:lineRule="auto"/>
         <w:ind w:right="140"/>
+        <w:jc w:val="both"/>
         <w:rPr>
           <w:sz w:val="23"/>
         </w:rPr>
@@ -10189,7 +10196,7 @@
         <w:ind w:left="861" w:hanging="360"/>
       </w:pPr>
       <w:rPr>
-        <w:rFonts w:ascii="Calibri" w:eastAsia="Calibri" w:hAnsi="Calibri" w:cs="Calibri" w:hint="default"/>
+        <w:rFonts w:ascii="Candara" w:eastAsia="Candara" w:hAnsi="Candara" w:cs="Candara" w:hint="default"/>
         <w:b w:val="0"/>
         <w:bCs w:val="0"/>
         <w:i w:val="0"/>
@@ -10310,7 +10317,7 @@
         <w:ind w:left="566" w:hanging="361"/>
       </w:pPr>
       <w:rPr>
-        <w:rFonts w:ascii="Symbol" w:eastAsia="Symbol" w:hAnsi="Symbol" w:cs="Symbol" w:hint="default"/>
+        <w:rFonts w:ascii="Candara" w:eastAsia="Candara" w:hAnsi="Candara" w:cs="Candara" w:hint="default"/>
         <w:b w:val="0"/>
         <w:bCs w:val="0"/>
         <w:i w:val="0"/>
@@ -10431,7 +10438,7 @@
         <w:ind w:left="861" w:hanging="360"/>
       </w:pPr>
       <w:rPr>
-        <w:rFonts w:ascii="Wingdings" w:eastAsia="Wingdings" w:hAnsi="Wingdings" w:cs="Wingdings" w:hint="default"/>
+        <w:rFonts w:ascii="Candara" w:eastAsia="Candara" w:hAnsi="Candara" w:cs="Candara" w:hint="default"/>
         <w:b w:val="0"/>
         <w:bCs w:val="0"/>
         <w:i w:val="0"/>
@@ -10552,7 +10559,7 @@
         <w:ind w:left="566" w:hanging="361"/>
       </w:pPr>
       <w:rPr>
-        <w:rFonts w:ascii="Symbol" w:eastAsia="Symbol" w:hAnsi="Symbol" w:cs="Symbol" w:hint="default"/>
+        <w:rFonts w:ascii="Candara" w:eastAsia="Candara" w:hAnsi="Candara" w:cs="Candara" w:hint="default"/>
         <w:b w:val="0"/>
         <w:bCs w:val="0"/>
         <w:i w:val="0"/>
@@ -10673,7 +10680,7 @@
         <w:ind w:left="830" w:hanging="360"/>
       </w:pPr>
       <w:rPr>
-        <w:rFonts w:ascii="Calibri" w:eastAsia="Calibri" w:hAnsi="Calibri" w:cs="Calibri" w:hint="default"/>
+        <w:rFonts w:ascii="Candara" w:eastAsia="Candara" w:hAnsi="Candara" w:cs="Candara" w:hint="default"/>
         <w:b w:val="0"/>
         <w:bCs w:val="0"/>
         <w:i w:val="0"/>
@@ -11092,7 +11099,7 @@
         <w:ind w:left="861" w:hanging="360"/>
       </w:pPr>
       <w:rPr>
-        <w:rFonts w:ascii="Wingdings" w:eastAsia="Wingdings" w:hAnsi="Wingdings" w:cs="Wingdings" w:hint="default"/>
+        <w:rFonts w:ascii="Candara" w:eastAsia="Candara" w:hAnsi="Candara" w:cs="Candara" w:hint="default"/>
         <w:b w:val="0"/>
         <w:bCs w:val="0"/>
         <w:i w:val="0"/>
@@ -11189,7 +11196,7 @@
         <w:ind w:left="861" w:hanging="360"/>
       </w:pPr>
       <w:rPr>
-        <w:rFonts w:ascii="Calibri" w:eastAsia="Calibri" w:hAnsi="Calibri" w:cs="Calibri" w:hint="default"/>
+        <w:rFonts w:ascii="Candara" w:eastAsia="Candara" w:hAnsi="Candara" w:cs="Candara" w:hint="default"/>
         <w:b w:val="0"/>
         <w:bCs w:val="0"/>
         <w:i w:val="0"/>
@@ -11209,7 +11216,7 @@
         <w:ind w:left="1581" w:hanging="360"/>
       </w:pPr>
       <w:rPr>
-        <w:rFonts w:ascii="Courier New" w:eastAsia="Courier New" w:hAnsi="Courier New" w:cs="Courier New" w:hint="default"/>
+        <w:rFonts w:ascii="Candara" w:eastAsia="Candara" w:hAnsi="Candara" w:cs="Candara" w:hint="default"/>
         <w:b w:val="0"/>
         <w:bCs w:val="0"/>
         <w:i w:val="0"/>
@@ -11318,7 +11325,7 @@
         <w:ind w:left="830" w:hanging="360"/>
       </w:pPr>
       <w:rPr>
-        <w:rFonts w:ascii="Calibri" w:eastAsia="Calibri" w:hAnsi="Calibri" w:cs="Calibri" w:hint="default"/>
+        <w:rFonts w:ascii="Candara" w:eastAsia="Candara" w:hAnsi="Candara" w:cs="Candara" w:hint="default"/>
         <w:b w:val="0"/>
         <w:bCs w:val="0"/>
         <w:i w:val="0"/>
@@ -11465,7 +11472,7 @@
   <w:docDefaults>
     <w:rPrDefault>
       <w:rPr>
-        <w:rFonts w:ascii="Nunito" w:eastAsia="Nunito" w:hAnsi="Nunito" w:cs="Nunito"/>
+        <w:rFonts w:ascii="Candara" w:eastAsia="Candara" w:hAnsi="Candara" w:cs="Candara"/>
         <w:color w:val="000000"/>
         <w:lang w:val="fr-CM" w:eastAsia="fr-CM" w:bidi="ar-SA"/>
       </w:rPr>

</xml_diff>